<commit_message>
Bold caps for inline terms (Ansible, Puppet, Azure DevOps etc.) in DevOps Q&A
Co-Authored-By: Claude Sonnet 5.5 <noreply@anthropic.com>
Claude-Session: https://claude.ai/code/session_0119xxGj3NY185HcqPsLitZ4
</commit_message>
<xml_diff>
--- a/devops/DevOps_Questions_and_Answers.docx
+++ b/devops/DevOps_Questions_and_Answers.docx
@@ -187,11 +187,20 @@
       <w:r>
         <w:rPr>
           <w:rFonts w:ascii="Calibri" w:hAnsi="Calibri" w:cs="Calibri" w:eastAsia="Calibri"/>
+          <w:b/>
+          <w:i w:val="0"/>
+          <w:sz w:val="21"/>
+        </w:rPr>
+        <w:t>ANSIBLE:</w:t>
+      </w:r>
+      <w:r>
+        <w:rPr>
+          <w:rFonts w:ascii="Calibri" w:hAnsi="Calibri" w:cs="Calibri" w:eastAsia="Calibri"/>
           <w:b w:val="0"/>
           <w:i w:val="0"/>
           <w:sz w:val="21"/>
         </w:rPr>
-        <w:t>Ansible: Uses YAML playbooks to automate configuration tasks.</w:t>
+        <w:t xml:space="preserve"> Uses YAML playbooks to automate configuration tasks.</w:t>
       </w:r>
     </w:p>
     <w:p>
@@ -213,11 +222,20 @@
       <w:r>
         <w:rPr>
           <w:rFonts w:ascii="Calibri" w:hAnsi="Calibri" w:cs="Calibri" w:eastAsia="Calibri"/>
+          <w:b/>
+          <w:i w:val="0"/>
+          <w:sz w:val="21"/>
+        </w:rPr>
+        <w:t>PUPPET:</w:t>
+      </w:r>
+      <w:r>
+        <w:rPr>
+          <w:rFonts w:ascii="Calibri" w:hAnsi="Calibri" w:cs="Calibri" w:eastAsia="Calibri"/>
           <w:b w:val="0"/>
           <w:i w:val="0"/>
           <w:sz w:val="21"/>
         </w:rPr>
-        <w:t>Puppet: Uses manifests and commonly follows a master-agent architecture.</w:t>
+        <w:t xml:space="preserve"> Uses manifests and commonly follows a master-agent architecture.</w:t>
       </w:r>
     </w:p>
     <w:p>
@@ -239,11 +257,20 @@
       <w:r>
         <w:rPr>
           <w:rFonts w:ascii="Calibri" w:hAnsi="Calibri" w:cs="Calibri" w:eastAsia="Calibri"/>
+          <w:b/>
+          <w:i w:val="0"/>
+          <w:sz w:val="21"/>
+        </w:rPr>
+        <w:t>CHEF:</w:t>
+      </w:r>
+      <w:r>
+        <w:rPr>
+          <w:rFonts w:ascii="Calibri" w:hAnsi="Calibri" w:cs="Calibri" w:eastAsia="Calibri"/>
           <w:b w:val="0"/>
           <w:i w:val="0"/>
           <w:sz w:val="21"/>
         </w:rPr>
-        <w:t>Chef: Uses recipes and cookbooks to define configurations.</w:t>
+        <w:t xml:space="preserve"> Uses recipes and cookbooks to define configurations.</w:t>
       </w:r>
     </w:p>
     <w:p>
@@ -265,11 +292,20 @@
       <w:r>
         <w:rPr>
           <w:rFonts w:ascii="Calibri" w:hAnsi="Calibri" w:cs="Calibri" w:eastAsia="Calibri"/>
+          <w:b/>
+          <w:i w:val="0"/>
+          <w:sz w:val="21"/>
+        </w:rPr>
+        <w:t>SALTSTACK:</w:t>
+      </w:r>
+      <w:r>
+        <w:rPr>
+          <w:rFonts w:ascii="Calibri" w:hAnsi="Calibri" w:cs="Calibri" w:eastAsia="Calibri"/>
           <w:b w:val="0"/>
           <w:i w:val="0"/>
           <w:sz w:val="21"/>
         </w:rPr>
-        <w:t>SaltStack: Supports configuration management and remote execution.</w:t>
+        <w:t xml:space="preserve"> Supports configuration management and remote execution.</w:t>
       </w:r>
     </w:p>
     <w:p>
@@ -2704,11 +2740,20 @@
       <w:r>
         <w:rPr>
           <w:rFonts w:ascii="Calibri" w:hAnsi="Calibri" w:cs="Calibri" w:eastAsia="Calibri"/>
+          <w:b/>
+          <w:i w:val="0"/>
+          <w:sz w:val="21"/>
+        </w:rPr>
+        <w:t>ELASTICSEARCH:</w:t>
+      </w:r>
+      <w:r>
+        <w:rPr>
+          <w:rFonts w:ascii="Calibri" w:hAnsi="Calibri" w:cs="Calibri" w:eastAsia="Calibri"/>
           <w:b w:val="0"/>
           <w:i w:val="0"/>
           <w:sz w:val="21"/>
         </w:rPr>
-        <w:t>Elasticsearch: Stores and searches log data.</w:t>
+        <w:t xml:space="preserve"> Stores and searches log data.</w:t>
       </w:r>
     </w:p>
     <w:p>
@@ -2730,11 +2775,20 @@
       <w:r>
         <w:rPr>
           <w:rFonts w:ascii="Calibri" w:hAnsi="Calibri" w:cs="Calibri" w:eastAsia="Calibri"/>
+          <w:b/>
+          <w:i w:val="0"/>
+          <w:sz w:val="21"/>
+        </w:rPr>
+        <w:t>LOGSTASH:</w:t>
+      </w:r>
+      <w:r>
+        <w:rPr>
+          <w:rFonts w:ascii="Calibri" w:hAnsi="Calibri" w:cs="Calibri" w:eastAsia="Calibri"/>
           <w:b w:val="0"/>
           <w:i w:val="0"/>
           <w:sz w:val="21"/>
         </w:rPr>
-        <w:t>Logstash: Collects, processes and transforms logs.</w:t>
+        <w:t xml:space="preserve"> Collects, processes and transforms logs.</w:t>
       </w:r>
     </w:p>
     <w:p>
@@ -2756,11 +2810,20 @@
       <w:r>
         <w:rPr>
           <w:rFonts w:ascii="Calibri" w:hAnsi="Calibri" w:cs="Calibri" w:eastAsia="Calibri"/>
+          <w:b/>
+          <w:i w:val="0"/>
+          <w:sz w:val="21"/>
+        </w:rPr>
+        <w:t>KIBANA:</w:t>
+      </w:r>
+      <w:r>
+        <w:rPr>
+          <w:rFonts w:ascii="Calibri" w:hAnsi="Calibri" w:cs="Calibri" w:eastAsia="Calibri"/>
           <w:b w:val="0"/>
           <w:i w:val="0"/>
           <w:sz w:val="21"/>
         </w:rPr>
-        <w:t>Kibana: Displays logs and creates dashboards.</w:t>
+        <w:t xml:space="preserve"> Displays logs and creates dashboards.</w:t>
       </w:r>
     </w:p>
     <w:p>
@@ -3651,11 +3714,20 @@
       <w:r>
         <w:rPr>
           <w:rFonts w:ascii="Calibri" w:hAnsi="Calibri" w:cs="Calibri" w:eastAsia="Calibri"/>
+          <w:b/>
+          <w:i w:val="0"/>
+          <w:sz w:val="21"/>
+        </w:rPr>
+        <w:t>AZURE DEVOPS:</w:t>
+      </w:r>
+      <w:r>
+        <w:rPr>
+          <w:rFonts w:ascii="Calibri" w:hAnsi="Calibri" w:cs="Calibri" w:eastAsia="Calibri"/>
           <w:b w:val="0"/>
           <w:i w:val="0"/>
           <w:sz w:val="21"/>
         </w:rPr>
-        <w:t>Azure DevOps: Manages code repositories, pipelines, tests and work items.</w:t>
+        <w:t xml:space="preserve"> Manages code repositories, pipelines, tests and work items.</w:t>
       </w:r>
     </w:p>
     <w:p>
@@ -3677,11 +3749,20 @@
       <w:r>
         <w:rPr>
           <w:rFonts w:ascii="Calibri" w:hAnsi="Calibri" w:cs="Calibri" w:eastAsia="Calibri"/>
+          <w:b/>
+          <w:i w:val="0"/>
+          <w:sz w:val="21"/>
+        </w:rPr>
+        <w:t>KUBERNETES:</w:t>
+      </w:r>
+      <w:r>
+        <w:rPr>
+          <w:rFonts w:ascii="Calibri" w:hAnsi="Calibri" w:cs="Calibri" w:eastAsia="Calibri"/>
           <w:b w:val="0"/>
           <w:i w:val="0"/>
           <w:sz w:val="21"/>
         </w:rPr>
-        <w:t>Kubernetes: Deploys and manages containerized applications.</w:t>
+        <w:t xml:space="preserve"> Deploys and manages containerized applications.</w:t>
       </w:r>
     </w:p>
     <w:p>
@@ -3703,11 +3784,20 @@
       <w:r>
         <w:rPr>
           <w:rFonts w:ascii="Calibri" w:hAnsi="Calibri" w:cs="Calibri" w:eastAsia="Calibri"/>
+          <w:b/>
+          <w:i w:val="0"/>
+          <w:sz w:val="21"/>
+        </w:rPr>
+        <w:t>CLOUD IOT PLATFORMS:</w:t>
+      </w:r>
+      <w:r>
+        <w:rPr>
+          <w:rFonts w:ascii="Calibri" w:hAnsi="Calibri" w:cs="Calibri" w:eastAsia="Calibri"/>
           <w:b w:val="0"/>
           <w:i w:val="0"/>
           <w:sz w:val="21"/>
         </w:rPr>
-        <w:t>Cloud IoT platforms: Collect device data and support remote monitoring.</w:t>
+        <w:t xml:space="preserve"> Collect device data and support remote monitoring.</w:t>
       </w:r>
     </w:p>
     <w:p>
@@ -4157,11 +4247,20 @@
       <w:r>
         <w:rPr>
           <w:rFonts w:ascii="Calibri" w:hAnsi="Calibri" w:cs="Calibri" w:eastAsia="Calibri"/>
+          <w:b/>
+          <w:i w:val="0"/>
+          <w:sz w:val="21"/>
+        </w:rPr>
+        <w:t>ANSIBLE:</w:t>
+      </w:r>
+      <w:r>
+        <w:rPr>
+          <w:rFonts w:ascii="Calibri" w:hAnsi="Calibri" w:cs="Calibri" w:eastAsia="Calibri"/>
           <w:b w:val="0"/>
           <w:i w:val="0"/>
           <w:sz w:val="21"/>
         </w:rPr>
-        <w:t>Ansible: Uses YAML playbooks and is commonly agentless.</w:t>
+        <w:t xml:space="preserve"> Uses YAML playbooks and is commonly agentless.</w:t>
       </w:r>
     </w:p>
     <w:p>
@@ -4183,11 +4282,20 @@
       <w:r>
         <w:rPr>
           <w:rFonts w:ascii="Calibri" w:hAnsi="Calibri" w:cs="Calibri" w:eastAsia="Calibri"/>
+          <w:b/>
+          <w:i w:val="0"/>
+          <w:sz w:val="21"/>
+        </w:rPr>
+        <w:t>PUPPET:</w:t>
+      </w:r>
+      <w:r>
+        <w:rPr>
+          <w:rFonts w:ascii="Calibri" w:hAnsi="Calibri" w:cs="Calibri" w:eastAsia="Calibri"/>
           <w:b w:val="0"/>
           <w:i w:val="0"/>
           <w:sz w:val="21"/>
         </w:rPr>
-        <w:t>Puppet: Uses manifests and commonly follows a master-agent model.</w:t>
+        <w:t xml:space="preserve"> Uses manifests and commonly follows a master-agent model.</w:t>
       </w:r>
     </w:p>
     <w:p>
@@ -4209,11 +4317,20 @@
       <w:r>
         <w:rPr>
           <w:rFonts w:ascii="Calibri" w:hAnsi="Calibri" w:cs="Calibri" w:eastAsia="Calibri"/>
+          <w:b/>
+          <w:i w:val="0"/>
+          <w:sz w:val="21"/>
+        </w:rPr>
+        <w:t>CHEF:</w:t>
+      </w:r>
+      <w:r>
+        <w:rPr>
+          <w:rFonts w:ascii="Calibri" w:hAnsi="Calibri" w:cs="Calibri" w:eastAsia="Calibri"/>
           <w:b w:val="0"/>
           <w:i w:val="0"/>
           <w:sz w:val="21"/>
         </w:rPr>
-        <w:t>Chef: Uses recipes and cookbooks.</w:t>
+        <w:t xml:space="preserve"> Uses recipes and cookbooks.</w:t>
       </w:r>
     </w:p>
     <w:p>
@@ -4235,11 +4352,20 @@
       <w:r>
         <w:rPr>
           <w:rFonts w:ascii="Calibri" w:hAnsi="Calibri" w:cs="Calibri" w:eastAsia="Calibri"/>
+          <w:b/>
+          <w:i w:val="0"/>
+          <w:sz w:val="21"/>
+        </w:rPr>
+        <w:t>SALTSTACK:</w:t>
+      </w:r>
+      <w:r>
+        <w:rPr>
+          <w:rFonts w:ascii="Calibri" w:hAnsi="Calibri" w:cs="Calibri" w:eastAsia="Calibri"/>
           <w:b w:val="0"/>
           <w:i w:val="0"/>
           <w:sz w:val="21"/>
         </w:rPr>
-        <w:t>SaltStack: Supports remote execution and configuration management.</w:t>
+        <w:t xml:space="preserve"> Supports remote execution and configuration management.</w:t>
       </w:r>
     </w:p>
     <w:p>
@@ -4447,120 +4573,6 @@
     </w:p>
     <w:p>
       <w:pPr>
-        <w:keepNext/>
-        <w:spacing w:after="60" w:before="160" w:line="269" w:lineRule="auto"/>
-        <w:jc w:val="left"/>
-      </w:pPr>
-      <w:r>
-        <w:rPr>
-          <w:rFonts w:ascii="Calibri" w:hAnsi="Calibri" w:cs="Calibri" w:eastAsia="Calibri"/>
-          <w:b/>
-          <w:i w:val="0"/>
-          <w:sz w:val="21"/>
-        </w:rPr>
-        <w:t>6. DEPLOY IT TO THE CLOUD ENVIRONMENT.</w:t>
-      </w:r>
-    </w:p>
-    <w:p>
-      <w:pPr>
-        <w:keepNext w:val="0"/>
-        <w:spacing w:after="40" w:before="0" w:line="269" w:lineRule="auto"/>
-        <w:jc w:val="left"/>
-      </w:pPr>
-      <w:r>
-        <w:rPr>
-          <w:rFonts w:ascii="Calibri" w:hAnsi="Calibri" w:cs="Calibri" w:eastAsia="Calibri"/>
-          <w:b/>
-          <w:i w:val="0"/>
-          <w:sz w:val="21"/>
-        </w:rPr>
-        <w:t>Example:</w:t>
-      </w:r>
-      <w:r>
-        <w:rPr>
-          <w:rFonts w:ascii="Calibri" w:hAnsi="Calibri" w:cs="Calibri" w:eastAsia="Calibri"/>
-          <w:b w:val="0"/>
-          <w:i w:val="0"/>
-          <w:sz w:val="21"/>
-        </w:rPr>
-        <w:t xml:space="preserve"> The same e-commerce container runs in development, testing and production.</w:t>
-      </w:r>
-    </w:p>
-    <w:p>
-      <w:pPr>
-        <w:keepNext w:val="0"/>
-        <w:spacing w:after="40" w:before="0" w:line="269" w:lineRule="auto"/>
-        <w:jc w:val="left"/>
-      </w:pPr>
-      <w:r>
-        <w:rPr>
-          <w:rFonts w:ascii="Calibri" w:hAnsi="Calibri" w:cs="Calibri" w:eastAsia="Calibri"/>
-          <w:b/>
-          <w:i w:val="0"/>
-          <w:sz w:val="21"/>
-        </w:rPr>
-        <w:t>Benefits:</w:t>
-      </w:r>
-      <w:r>
-        <w:rPr>
-          <w:rFonts w:ascii="Calibri" w:hAnsi="Calibri" w:cs="Calibri" w:eastAsia="Calibri"/>
-          <w:b w:val="0"/>
-          <w:i w:val="0"/>
-          <w:sz w:val="21"/>
-        </w:rPr>
-        <w:t xml:space="preserve"> Portability, isolation, consistent environments and simpler deployment.</w:t>
-      </w:r>
-    </w:p>
-    <w:p>
-      <w:pPr>
-        <w:keepNext/>
-        <w:spacing w:after="60" w:before="160" w:line="269" w:lineRule="auto"/>
-        <w:jc w:val="left"/>
-      </w:pPr>
-      <w:r>
-        <w:rPr>
-          <w:rFonts w:ascii="Calibri" w:hAnsi="Calibri" w:cs="Calibri" w:eastAsia="Calibri"/>
-          <w:b/>
-          <w:i w:val="0"/>
-          <w:sz w:val="21"/>
-        </w:rPr>
-        <w:t>4. (C) CI/CD WORKFLOW</w:t>
-      </w:r>
-    </w:p>
-    <w:p>
-      <w:pPr>
-        <w:keepNext w:val="0"/>
-        <w:spacing w:after="40" w:before="0" w:line="269" w:lineRule="auto"/>
-        <w:jc w:val="left"/>
-      </w:pPr>
-      <w:r>
-        <w:rPr>
-          <w:rFonts w:ascii="Calibri" w:hAnsi="Calibri" w:cs="Calibri" w:eastAsia="Calibri"/>
-          <w:b w:val="0"/>
-          <w:i w:val="0"/>
-          <w:sz w:val="21"/>
-        </w:rPr>
-        <w:t>CI/CD automates the integration, testing and delivery of software.</w:t>
-      </w:r>
-    </w:p>
-    <w:p>
-      <w:pPr>
-        <w:keepNext w:val="0"/>
-        <w:spacing w:after="40" w:before="0" w:line="269" w:lineRule="auto"/>
-        <w:jc w:val="left"/>
-      </w:pPr>
-      <w:r>
-        <w:rPr>
-          <w:rFonts w:ascii="Calibri" w:hAnsi="Calibri" w:cs="Calibri" w:eastAsia="Calibri"/>
-          <w:b/>
-          <w:i w:val="0"/>
-          <w:sz w:val="21"/>
-        </w:rPr>
-        <w:t>Workflow:</w:t>
-      </w:r>
-    </w:p>
-    <w:p>
-      <w:pPr>
         <w:keepNext w:val="0"/>
         <w:spacing w:after="50" w:before="0" w:line="264" w:lineRule="auto"/>
         <w:ind w:left="369" w:hanging="227"/>
@@ -4573,7 +4585,7 @@
           <w:color w:val="000000"/>
           <w:sz w:val="21"/>
         </w:rPr>
-        <w:t xml:space="preserve">1. </w:t>
+        <w:t xml:space="preserve">6. </w:t>
       </w:r>
       <w:r>
         <w:rPr>
@@ -4582,7 +4594,105 @@
           <w:i w:val="0"/>
           <w:sz w:val="21"/>
         </w:rPr>
-        <w:t>Developers commit code to a shared repository.</w:t>
+        <w:t>Deploy it to the cloud environment.</w:t>
+      </w:r>
+    </w:p>
+    <w:p>
+      <w:pPr>
+        <w:keepNext w:val="0"/>
+        <w:spacing w:after="40" w:before="0" w:line="269" w:lineRule="auto"/>
+        <w:jc w:val="left"/>
+      </w:pPr>
+      <w:r>
+        <w:rPr>
+          <w:rFonts w:ascii="Calibri" w:hAnsi="Calibri" w:cs="Calibri" w:eastAsia="Calibri"/>
+          <w:b/>
+          <w:i w:val="0"/>
+          <w:sz w:val="21"/>
+        </w:rPr>
+        <w:t>Example:</w:t>
+      </w:r>
+      <w:r>
+        <w:rPr>
+          <w:rFonts w:ascii="Calibri" w:hAnsi="Calibri" w:cs="Calibri" w:eastAsia="Calibri"/>
+          <w:b w:val="0"/>
+          <w:i w:val="0"/>
+          <w:sz w:val="21"/>
+        </w:rPr>
+        <w:t xml:space="preserve"> The same e-commerce container runs in development, testing and production.</w:t>
+      </w:r>
+    </w:p>
+    <w:p>
+      <w:pPr>
+        <w:keepNext w:val="0"/>
+        <w:spacing w:after="40" w:before="0" w:line="269" w:lineRule="auto"/>
+        <w:jc w:val="left"/>
+      </w:pPr>
+      <w:r>
+        <w:rPr>
+          <w:rFonts w:ascii="Calibri" w:hAnsi="Calibri" w:cs="Calibri" w:eastAsia="Calibri"/>
+          <w:b/>
+          <w:i w:val="0"/>
+          <w:sz w:val="21"/>
+        </w:rPr>
+        <w:t>Benefits:</w:t>
+      </w:r>
+      <w:r>
+        <w:rPr>
+          <w:rFonts w:ascii="Calibri" w:hAnsi="Calibri" w:cs="Calibri" w:eastAsia="Calibri"/>
+          <w:b w:val="0"/>
+          <w:i w:val="0"/>
+          <w:sz w:val="21"/>
+        </w:rPr>
+        <w:t xml:space="preserve"> Portability, isolation, consistent environments and simpler deployment.</w:t>
+      </w:r>
+    </w:p>
+    <w:p>
+      <w:pPr>
+        <w:keepNext/>
+        <w:spacing w:after="60" w:before="160" w:line="269" w:lineRule="auto"/>
+        <w:jc w:val="left"/>
+      </w:pPr>
+      <w:r>
+        <w:rPr>
+          <w:rFonts w:ascii="Calibri" w:hAnsi="Calibri" w:cs="Calibri" w:eastAsia="Calibri"/>
+          <w:b/>
+          <w:i w:val="0"/>
+          <w:sz w:val="21"/>
+        </w:rPr>
+        <w:t>4. (C) CI/CD WORKFLOW</w:t>
+      </w:r>
+    </w:p>
+    <w:p>
+      <w:pPr>
+        <w:keepNext w:val="0"/>
+        <w:spacing w:after="40" w:before="0" w:line="269" w:lineRule="auto"/>
+        <w:jc w:val="left"/>
+      </w:pPr>
+      <w:r>
+        <w:rPr>
+          <w:rFonts w:ascii="Calibri" w:hAnsi="Calibri" w:cs="Calibri" w:eastAsia="Calibri"/>
+          <w:b w:val="0"/>
+          <w:i w:val="0"/>
+          <w:sz w:val="21"/>
+        </w:rPr>
+        <w:t>CI/CD automates the integration, testing and delivery of software.</w:t>
+      </w:r>
+    </w:p>
+    <w:p>
+      <w:pPr>
+        <w:keepNext w:val="0"/>
+        <w:spacing w:after="40" w:before="0" w:line="269" w:lineRule="auto"/>
+        <w:jc w:val="left"/>
+      </w:pPr>
+      <w:r>
+        <w:rPr>
+          <w:rFonts w:ascii="Calibri" w:hAnsi="Calibri" w:cs="Calibri" w:eastAsia="Calibri"/>
+          <w:b/>
+          <w:i w:val="0"/>
+          <w:sz w:val="21"/>
+        </w:rPr>
+        <w:t>Workflow:</w:t>
       </w:r>
     </w:p>
     <w:p>
@@ -4599,7 +4709,7 @@
           <w:color w:val="000000"/>
           <w:sz w:val="21"/>
         </w:rPr>
-        <w:t xml:space="preserve">2. </w:t>
+        <w:t xml:space="preserve">1. </w:t>
       </w:r>
       <w:r>
         <w:rPr>
@@ -4608,7 +4718,7 @@
           <w:i w:val="0"/>
           <w:sz w:val="21"/>
         </w:rPr>
-        <w:t>The CI pipeline starts automatically.</w:t>
+        <w:t>Developers commit code to a shared repository.</w:t>
       </w:r>
     </w:p>
     <w:p>
@@ -4625,7 +4735,7 @@
           <w:color w:val="000000"/>
           <w:sz w:val="21"/>
         </w:rPr>
-        <w:t xml:space="preserve">3. </w:t>
+        <w:t xml:space="preserve">2. </w:t>
       </w:r>
       <w:r>
         <w:rPr>
@@ -4634,7 +4744,7 @@
           <w:i w:val="0"/>
           <w:sz w:val="21"/>
         </w:rPr>
-        <w:t>The application is built.</w:t>
+        <w:t>The CI pipeline starts automatically.</w:t>
       </w:r>
     </w:p>
     <w:p>
@@ -4651,7 +4761,7 @@
           <w:color w:val="000000"/>
           <w:sz w:val="21"/>
         </w:rPr>
-        <w:t xml:space="preserve">4. </w:t>
+        <w:t xml:space="preserve">3. </w:t>
       </w:r>
       <w:r>
         <w:rPr>
@@ -4660,7 +4770,7 @@
           <w:i w:val="0"/>
           <w:sz w:val="21"/>
         </w:rPr>
-        <w:t>Automated tests are executed.</w:t>
+        <w:t>The application is built.</w:t>
       </w:r>
     </w:p>
     <w:p>
@@ -4677,7 +4787,7 @@
           <w:color w:val="000000"/>
           <w:sz w:val="21"/>
         </w:rPr>
-        <w:t xml:space="preserve">5. </w:t>
+        <w:t xml:space="preserve">4. </w:t>
       </w:r>
       <w:r>
         <w:rPr>
@@ -4686,7 +4796,7 @@
           <w:i w:val="0"/>
           <w:sz w:val="21"/>
         </w:rPr>
-        <w:t>Quality and security checks are performed.</w:t>
+        <w:t>Automated tests are executed.</w:t>
       </w:r>
     </w:p>
     <w:p>
@@ -4703,7 +4813,7 @@
           <w:color w:val="000000"/>
           <w:sz w:val="21"/>
         </w:rPr>
-        <w:t xml:space="preserve">6. </w:t>
+        <w:t xml:space="preserve">5. </w:t>
       </w:r>
       <w:r>
         <w:rPr>
@@ -4712,7 +4822,7 @@
           <w:i w:val="0"/>
           <w:sz w:val="21"/>
         </w:rPr>
-        <w:t>The application is packaged into a Docker image.</w:t>
+        <w:t>Quality and security checks are performed.</w:t>
       </w:r>
     </w:p>
     <w:p>
@@ -4729,7 +4839,7 @@
           <w:color w:val="000000"/>
           <w:sz w:val="21"/>
         </w:rPr>
-        <w:t xml:space="preserve">7. </w:t>
+        <w:t xml:space="preserve">6. </w:t>
       </w:r>
       <w:r>
         <w:rPr>
@@ -4738,7 +4848,7 @@
           <w:i w:val="0"/>
           <w:sz w:val="21"/>
         </w:rPr>
-        <w:t>The application is deployed to staging and verified.</w:t>
+        <w:t>The application is packaged into a Docker image.</w:t>
       </w:r>
     </w:p>
     <w:p>
@@ -4755,6 +4865,32 @@
           <w:color w:val="000000"/>
           <w:sz w:val="21"/>
         </w:rPr>
+        <w:t xml:space="preserve">7. </w:t>
+      </w:r>
+      <w:r>
+        <w:rPr>
+          <w:rFonts w:ascii="Calibri" w:hAnsi="Calibri" w:cs="Calibri" w:eastAsia="Calibri"/>
+          <w:b w:val="0"/>
+          <w:i w:val="0"/>
+          <w:sz w:val="21"/>
+        </w:rPr>
+        <w:t>The application is deployed to staging and verified.</w:t>
+      </w:r>
+    </w:p>
+    <w:p>
+      <w:pPr>
+        <w:keepNext w:val="0"/>
+        <w:spacing w:after="50" w:before="0" w:line="264" w:lineRule="auto"/>
+        <w:ind w:left="369" w:hanging="227"/>
+        <w:jc w:val="left"/>
+      </w:pPr>
+      <w:r>
+        <w:rPr>
+          <w:rFonts w:ascii="Calibri" w:hAnsi="Calibri" w:cs="Calibri" w:eastAsia="Calibri"/>
+          <w:b/>
+          <w:color w:val="000000"/>
+          <w:sz w:val="21"/>
+        </w:rPr>
         <w:t xml:space="preserve">8. </w:t>
       </w:r>
       <w:r>
@@ -4769,18 +4905,28 @@
     </w:p>
     <w:p>
       <w:pPr>
-        <w:keepNext/>
-        <w:spacing w:after="60" w:before="160" w:line="269" w:lineRule="auto"/>
-        <w:jc w:val="left"/>
-      </w:pPr>
-      <w:r>
-        <w:rPr>
-          <w:rFonts w:ascii="Calibri" w:hAnsi="Calibri" w:cs="Calibri" w:eastAsia="Calibri"/>
-          <w:b/>
-          <w:i w:val="0"/>
-          <w:sz w:val="21"/>
-        </w:rPr>
-        <w:t>9. MONITORING CHECKS APPLICATION HEALTH.</w:t>
+        <w:keepNext w:val="0"/>
+        <w:spacing w:after="50" w:before="0" w:line="264" w:lineRule="auto"/>
+        <w:ind w:left="369" w:hanging="227"/>
+        <w:jc w:val="left"/>
+      </w:pPr>
+      <w:r>
+        <w:rPr>
+          <w:rFonts w:ascii="Calibri" w:hAnsi="Calibri" w:cs="Calibri" w:eastAsia="Calibri"/>
+          <w:b/>
+          <w:color w:val="000000"/>
+          <w:sz w:val="21"/>
+        </w:rPr>
+        <w:t xml:space="preserve">9. </w:t>
+      </w:r>
+      <w:r>
+        <w:rPr>
+          <w:rFonts w:ascii="Calibri" w:hAnsi="Calibri" w:cs="Calibri" w:eastAsia="Calibri"/>
+          <w:b w:val="0"/>
+          <w:i w:val="0"/>
+          <w:sz w:val="21"/>
+        </w:rPr>
+        <w:t>Monitoring checks application health.</w:t>
       </w:r>
     </w:p>
     <w:p>
@@ -4866,11 +5012,20 @@
       <w:r>
         <w:rPr>
           <w:rFonts w:ascii="Calibri" w:hAnsi="Calibri" w:cs="Calibri" w:eastAsia="Calibri"/>
+          <w:b/>
+          <w:i w:val="0"/>
+          <w:sz w:val="21"/>
+        </w:rPr>
+        <w:t>NAGIOS:</w:t>
+      </w:r>
+      <w:r>
+        <w:rPr>
+          <w:rFonts w:ascii="Calibri" w:hAnsi="Calibri" w:cs="Calibri" w:eastAsia="Calibri"/>
           <w:b w:val="0"/>
           <w:i w:val="0"/>
           <w:sz w:val="21"/>
         </w:rPr>
-        <w:t>Nagios: Checks server and service availability.</w:t>
+        <w:t xml:space="preserve"> Checks server and service availability.</w:t>
       </w:r>
     </w:p>
     <w:p>
@@ -4892,11 +5047,20 @@
       <w:r>
         <w:rPr>
           <w:rFonts w:ascii="Calibri" w:hAnsi="Calibri" w:cs="Calibri" w:eastAsia="Calibri"/>
+          <w:b/>
+          <w:i w:val="0"/>
+          <w:sz w:val="21"/>
+        </w:rPr>
+        <w:t>GRAPHITE:</w:t>
+      </w:r>
+      <w:r>
+        <w:rPr>
+          <w:rFonts w:ascii="Calibri" w:hAnsi="Calibri" w:cs="Calibri" w:eastAsia="Calibri"/>
           <w:b w:val="0"/>
           <w:i w:val="0"/>
           <w:sz w:val="21"/>
         </w:rPr>
-        <w:t>Graphite: Stores and visualizes performance metrics.</w:t>
+        <w:t xml:space="preserve"> Stores and visualizes performance metrics.</w:t>
       </w:r>
     </w:p>
     <w:p>
@@ -4918,11 +5082,20 @@
       <w:r>
         <w:rPr>
           <w:rFonts w:ascii="Calibri" w:hAnsi="Calibri" w:cs="Calibri" w:eastAsia="Calibri"/>
+          <w:b/>
+          <w:i w:val="0"/>
+          <w:sz w:val="21"/>
+        </w:rPr>
+        <w:t>MUNIN:</w:t>
+      </w:r>
+      <w:r>
+        <w:rPr>
+          <w:rFonts w:ascii="Calibri" w:hAnsi="Calibri" w:cs="Calibri" w:eastAsia="Calibri"/>
           <w:b w:val="0"/>
           <w:i w:val="0"/>
           <w:sz w:val="21"/>
         </w:rPr>
-        <w:t>Munin: Graphs system resource usage.</w:t>
+        <w:t xml:space="preserve"> Graphs system resource usage.</w:t>
       </w:r>
     </w:p>
     <w:p>
@@ -5017,11 +5190,20 @@
       <w:r>
         <w:rPr>
           <w:rFonts w:ascii="Calibri" w:hAnsi="Calibri" w:cs="Calibri" w:eastAsia="Calibri"/>
+          <w:b/>
+          <w:i w:val="0"/>
+          <w:sz w:val="21"/>
+        </w:rPr>
+        <w:t>LOGSTASH:</w:t>
+      </w:r>
+      <w:r>
+        <w:rPr>
+          <w:rFonts w:ascii="Calibri" w:hAnsi="Calibri" w:cs="Calibri" w:eastAsia="Calibri"/>
           <w:b w:val="0"/>
           <w:i w:val="0"/>
           <w:sz w:val="21"/>
         </w:rPr>
-        <w:t>Logstash: Collects and processes logs.</w:t>
+        <w:t xml:space="preserve"> Collects and processes logs.</w:t>
       </w:r>
     </w:p>
     <w:p>
@@ -5043,11 +5225,20 @@
       <w:r>
         <w:rPr>
           <w:rFonts w:ascii="Calibri" w:hAnsi="Calibri" w:cs="Calibri" w:eastAsia="Calibri"/>
+          <w:b/>
+          <w:i w:val="0"/>
+          <w:sz w:val="21"/>
+        </w:rPr>
+        <w:t>ELASTICSEARCH:</w:t>
+      </w:r>
+      <w:r>
+        <w:rPr>
+          <w:rFonts w:ascii="Calibri" w:hAnsi="Calibri" w:cs="Calibri" w:eastAsia="Calibri"/>
           <w:b w:val="0"/>
           <w:i w:val="0"/>
           <w:sz w:val="21"/>
         </w:rPr>
-        <w:t>Elasticsearch: Indexes and stores logs.</w:t>
+        <w:t xml:space="preserve"> Indexes and stores logs.</w:t>
       </w:r>
     </w:p>
     <w:p>
@@ -5069,11 +5260,20 @@
       <w:r>
         <w:rPr>
           <w:rFonts w:ascii="Calibri" w:hAnsi="Calibri" w:cs="Calibri" w:eastAsia="Calibri"/>
+          <w:b/>
+          <w:i w:val="0"/>
+          <w:sz w:val="21"/>
+        </w:rPr>
+        <w:t>KIBANA:</w:t>
+      </w:r>
+      <w:r>
+        <w:rPr>
+          <w:rFonts w:ascii="Calibri" w:hAnsi="Calibri" w:cs="Calibri" w:eastAsia="Calibri"/>
           <w:b w:val="0"/>
           <w:i w:val="0"/>
           <w:sz w:val="21"/>
         </w:rPr>
-        <w:t>Kibana: Displays logs and dashboards.</w:t>
+        <w:t xml:space="preserve"> Displays logs and dashboards.</w:t>
       </w:r>
     </w:p>
     <w:p>
@@ -5813,11 +6013,20 @@
       <w:r>
         <w:rPr>
           <w:rFonts w:ascii="Calibri" w:hAnsi="Calibri" w:cs="Calibri" w:eastAsia="Calibri"/>
+          <w:b/>
+          <w:i w:val="0"/>
+          <w:sz w:val="21"/>
+        </w:rPr>
+        <w:t>CODE COMMIT:</w:t>
+      </w:r>
+      <w:r>
+        <w:rPr>
+          <w:rFonts w:ascii="Calibri" w:hAnsi="Calibri" w:cs="Calibri" w:eastAsia="Calibri"/>
           <w:b w:val="0"/>
           <w:i w:val="0"/>
           <w:sz w:val="21"/>
         </w:rPr>
-        <w:t>Code commit: Developers submit changes to a shared repository.</w:t>
+        <w:t xml:space="preserve"> Developers submit changes to a shared repository.</w:t>
       </w:r>
     </w:p>
     <w:p>
@@ -5839,11 +6048,20 @@
       <w:r>
         <w:rPr>
           <w:rFonts w:ascii="Calibri" w:hAnsi="Calibri" w:cs="Calibri" w:eastAsia="Calibri"/>
+          <w:b/>
+          <w:i w:val="0"/>
+          <w:sz w:val="21"/>
+        </w:rPr>
+        <w:t>VERSION CONTROL:</w:t>
+      </w:r>
+      <w:r>
+        <w:rPr>
+          <w:rFonts w:ascii="Calibri" w:hAnsi="Calibri" w:cs="Calibri" w:eastAsia="Calibri"/>
           <w:b w:val="0"/>
           <w:i w:val="0"/>
           <w:sz w:val="21"/>
         </w:rPr>
-        <w:t>Version control: Git tracks changes and supports collaboration.</w:t>
+        <w:t xml:space="preserve"> Git tracks changes and supports collaboration.</w:t>
       </w:r>
     </w:p>
     <w:p>
@@ -5865,11 +6083,20 @@
       <w:r>
         <w:rPr>
           <w:rFonts w:ascii="Calibri" w:hAnsi="Calibri" w:cs="Calibri" w:eastAsia="Calibri"/>
+          <w:b/>
+          <w:i w:val="0"/>
+          <w:sz w:val="21"/>
+        </w:rPr>
+        <w:t>INTEGRATION TRIGGER:</w:t>
+      </w:r>
+      <w:r>
+        <w:rPr>
+          <w:rFonts w:ascii="Calibri" w:hAnsi="Calibri" w:cs="Calibri" w:eastAsia="Calibri"/>
           <w:b w:val="0"/>
           <w:i w:val="0"/>
           <w:sz w:val="21"/>
         </w:rPr>
-        <w:t>Integration trigger: A new commit starts the CI pipeline.</w:t>
+        <w:t xml:space="preserve"> A new commit starts the CI pipeline.</w:t>
       </w:r>
     </w:p>
     <w:p>
@@ -5891,11 +6118,20 @@
       <w:r>
         <w:rPr>
           <w:rFonts w:ascii="Calibri" w:hAnsi="Calibri" w:cs="Calibri" w:eastAsia="Calibri"/>
+          <w:b/>
+          <w:i w:val="0"/>
+          <w:sz w:val="21"/>
+        </w:rPr>
+        <w:t>CODE REVIEW:</w:t>
+      </w:r>
+      <w:r>
+        <w:rPr>
+          <w:rFonts w:ascii="Calibri" w:hAnsi="Calibri" w:cs="Calibri" w:eastAsia="Calibri"/>
           <w:b w:val="0"/>
           <w:i w:val="0"/>
           <w:sz w:val="21"/>
         </w:rPr>
-        <w:t>Code review: Changes are reviewed before merging.</w:t>
+        <w:t xml:space="preserve"> Changes are reviewed before merging.</w:t>
       </w:r>
     </w:p>
     <w:p>
@@ -5917,11 +6153,20 @@
       <w:r>
         <w:rPr>
           <w:rFonts w:ascii="Calibri" w:hAnsi="Calibri" w:cs="Calibri" w:eastAsia="Calibri"/>
+          <w:b/>
+          <w:i w:val="0"/>
+          <w:sz w:val="21"/>
+        </w:rPr>
+        <w:t>BUILD:</w:t>
+      </w:r>
+      <w:r>
+        <w:rPr>
+          <w:rFonts w:ascii="Calibri" w:hAnsi="Calibri" w:cs="Calibri" w:eastAsia="Calibri"/>
           <w:b w:val="0"/>
           <w:i w:val="0"/>
           <w:sz w:val="21"/>
         </w:rPr>
-        <w:t>Build: The application is compiled or packaged.</w:t>
+        <w:t xml:space="preserve"> The application is compiled or packaged.</w:t>
       </w:r>
     </w:p>
     <w:p>
@@ -5943,11 +6188,20 @@
       <w:r>
         <w:rPr>
           <w:rFonts w:ascii="Calibri" w:hAnsi="Calibri" w:cs="Calibri" w:eastAsia="Calibri"/>
+          <w:b/>
+          <w:i w:val="0"/>
+          <w:sz w:val="21"/>
+        </w:rPr>
+        <w:t>TESTING:</w:t>
+      </w:r>
+      <w:r>
+        <w:rPr>
+          <w:rFonts w:ascii="Calibri" w:hAnsi="Calibri" w:cs="Calibri" w:eastAsia="Calibri"/>
           <w:b w:val="0"/>
           <w:i w:val="0"/>
           <w:sz w:val="21"/>
         </w:rPr>
-        <w:t>Testing: Automated tests check functionality and integration.</w:t>
+        <w:t xml:space="preserve"> Automated tests check functionality and integration.</w:t>
       </w:r>
     </w:p>
     <w:p>
@@ -5969,11 +6223,20 @@
       <w:r>
         <w:rPr>
           <w:rFonts w:ascii="Calibri" w:hAnsi="Calibri" w:cs="Calibri" w:eastAsia="Calibri"/>
+          <w:b/>
+          <w:i w:val="0"/>
+          <w:sz w:val="21"/>
+        </w:rPr>
+        <w:t>QUALITY AND SECURITY CHECKS:</w:t>
+      </w:r>
+      <w:r>
+        <w:rPr>
+          <w:rFonts w:ascii="Calibri" w:hAnsi="Calibri" w:cs="Calibri" w:eastAsia="Calibri"/>
           <w:b w:val="0"/>
           <w:i w:val="0"/>
           <w:sz w:val="21"/>
         </w:rPr>
-        <w:t>Quality and security checks: Tools examine code quality and known vulnerabilities.</w:t>
+        <w:t xml:space="preserve"> Tools examine code quality and known vulnerabilities.</w:t>
       </w:r>
     </w:p>
     <w:p>
@@ -5995,11 +6258,20 @@
       <w:r>
         <w:rPr>
           <w:rFonts w:ascii="Calibri" w:hAnsi="Calibri" w:cs="Calibri" w:eastAsia="Calibri"/>
+          <w:b/>
+          <w:i w:val="0"/>
+          <w:sz w:val="21"/>
+        </w:rPr>
+        <w:t>DELIVERY:</w:t>
+      </w:r>
+      <w:r>
+        <w:rPr>
+          <w:rFonts w:ascii="Calibri" w:hAnsi="Calibri" w:cs="Calibri" w:eastAsia="Calibri"/>
           <w:b w:val="0"/>
           <w:i w:val="0"/>
           <w:sz w:val="21"/>
         </w:rPr>
-        <w:t>Delivery: Successful builds move to staging and then toward production.</w:t>
+        <w:t xml:space="preserve"> Successful builds move to staging and then toward production.</w:t>
       </w:r>
     </w:p>
     <w:p>
@@ -6172,11 +6444,20 @@
       <w:r>
         <w:rPr>
           <w:rFonts w:ascii="Calibri" w:hAnsi="Calibri" w:cs="Calibri" w:eastAsia="Calibri"/>
+          <w:b/>
+          <w:i w:val="0"/>
+          <w:sz w:val="21"/>
+        </w:rPr>
+        <w:t>UNIT TESTING:</w:t>
+      </w:r>
+      <w:r>
+        <w:rPr>
+          <w:rFonts w:ascii="Calibri" w:hAnsi="Calibri" w:cs="Calibri" w:eastAsia="Calibri"/>
           <w:b w:val="0"/>
           <w:i w:val="0"/>
           <w:sz w:val="21"/>
         </w:rPr>
-        <w:t>Unit testing: Checks individual functions.</w:t>
+        <w:t xml:space="preserve"> Checks individual functions.</w:t>
       </w:r>
     </w:p>
     <w:p>
@@ -6198,11 +6479,20 @@
       <w:r>
         <w:rPr>
           <w:rFonts w:ascii="Calibri" w:hAnsi="Calibri" w:cs="Calibri" w:eastAsia="Calibri"/>
+          <w:b/>
+          <w:i w:val="0"/>
+          <w:sz w:val="21"/>
+        </w:rPr>
+        <w:t>INTEGRATION TESTING:</w:t>
+      </w:r>
+      <w:r>
+        <w:rPr>
+          <w:rFonts w:ascii="Calibri" w:hAnsi="Calibri" w:cs="Calibri" w:eastAsia="Calibri"/>
           <w:b w:val="0"/>
           <w:i w:val="0"/>
           <w:sz w:val="21"/>
         </w:rPr>
-        <w:t>Integration testing: Checks communication between modules.</w:t>
+        <w:t xml:space="preserve"> Checks communication between modules.</w:t>
       </w:r>
     </w:p>
     <w:p>
@@ -6224,11 +6514,20 @@
       <w:r>
         <w:rPr>
           <w:rFonts w:ascii="Calibri" w:hAnsi="Calibri" w:cs="Calibri" w:eastAsia="Calibri"/>
+          <w:b/>
+          <w:i w:val="0"/>
+          <w:sz w:val="21"/>
+        </w:rPr>
+        <w:t>FUNCTIONAL TESTING:</w:t>
+      </w:r>
+      <w:r>
+        <w:rPr>
+          <w:rFonts w:ascii="Calibri" w:hAnsi="Calibri" w:cs="Calibri" w:eastAsia="Calibri"/>
           <w:b w:val="0"/>
           <w:i w:val="0"/>
           <w:sz w:val="21"/>
         </w:rPr>
-        <w:t>Functional testing: Checks whether requirements work correctly.</w:t>
+        <w:t xml:space="preserve"> Checks whether requirements work correctly.</w:t>
       </w:r>
     </w:p>
     <w:p>
@@ -6250,11 +6549,20 @@
       <w:r>
         <w:rPr>
           <w:rFonts w:ascii="Calibri" w:hAnsi="Calibri" w:cs="Calibri" w:eastAsia="Calibri"/>
+          <w:b/>
+          <w:i w:val="0"/>
+          <w:sz w:val="21"/>
+        </w:rPr>
+        <w:t>SECURITY TESTING:</w:t>
+      </w:r>
+      <w:r>
+        <w:rPr>
+          <w:rFonts w:ascii="Calibri" w:hAnsi="Calibri" w:cs="Calibri" w:eastAsia="Calibri"/>
           <w:b w:val="0"/>
           <w:i w:val="0"/>
           <w:sz w:val="21"/>
         </w:rPr>
-        <w:t>Security testing: Identifies potential security weaknesses.</w:t>
+        <w:t xml:space="preserve"> Identifies potential security weaknesses.</w:t>
       </w:r>
     </w:p>
     <w:p>
@@ -6276,11 +6584,20 @@
       <w:r>
         <w:rPr>
           <w:rFonts w:ascii="Calibri" w:hAnsi="Calibri" w:cs="Calibri" w:eastAsia="Calibri"/>
+          <w:b/>
+          <w:i w:val="0"/>
+          <w:sz w:val="21"/>
+        </w:rPr>
+        <w:t>REGRESSION TESTING:</w:t>
+      </w:r>
+      <w:r>
+        <w:rPr>
+          <w:rFonts w:ascii="Calibri" w:hAnsi="Calibri" w:cs="Calibri" w:eastAsia="Calibri"/>
           <w:b w:val="0"/>
           <w:i w:val="0"/>
           <w:sz w:val="21"/>
         </w:rPr>
-        <w:t>Regression testing: Ensures existing features continue working after changes.</w:t>
+        <w:t xml:space="preserve"> Ensures existing features continue working after changes.</w:t>
       </w:r>
     </w:p>
     <w:p>
@@ -6598,11 +6915,20 @@
       <w:r>
         <w:rPr>
           <w:rFonts w:ascii="Calibri" w:hAnsi="Calibri" w:cs="Calibri" w:eastAsia="Calibri"/>
+          <w:b/>
+          <w:i w:val="0"/>
+          <w:sz w:val="21"/>
+        </w:rPr>
+        <w:t>NAGIOS:</w:t>
+      </w:r>
+      <w:r>
+        <w:rPr>
+          <w:rFonts w:ascii="Calibri" w:hAnsi="Calibri" w:cs="Calibri" w:eastAsia="Calibri"/>
           <w:b w:val="0"/>
           <w:i w:val="0"/>
           <w:sz w:val="21"/>
         </w:rPr>
-        <w:t>Nagios: Detects service availability problems.</w:t>
+        <w:t xml:space="preserve"> Detects service availability problems.</w:t>
       </w:r>
     </w:p>
     <w:p>
@@ -6624,11 +6950,20 @@
       <w:r>
         <w:rPr>
           <w:rFonts w:ascii="Calibri" w:hAnsi="Calibri" w:cs="Calibri" w:eastAsia="Calibri"/>
+          <w:b/>
+          <w:i w:val="0"/>
+          <w:sz w:val="21"/>
+        </w:rPr>
+        <w:t>GRAPHITE:</w:t>
+      </w:r>
+      <w:r>
+        <w:rPr>
+          <w:rFonts w:ascii="Calibri" w:hAnsi="Calibri" w:cs="Calibri" w:eastAsia="Calibri"/>
           <w:b w:val="0"/>
           <w:i w:val="0"/>
           <w:sz w:val="21"/>
         </w:rPr>
-        <w:t>Graphite: Displays response time and resource usage.</w:t>
+        <w:t xml:space="preserve"> Displays response time and resource usage.</w:t>
       </w:r>
     </w:p>
     <w:p>
@@ -6650,11 +6985,20 @@
       <w:r>
         <w:rPr>
           <w:rFonts w:ascii="Calibri" w:hAnsi="Calibri" w:cs="Calibri" w:eastAsia="Calibri"/>
+          <w:b/>
+          <w:i w:val="0"/>
+          <w:sz w:val="21"/>
+        </w:rPr>
+        <w:t>ELK STACK:</w:t>
+      </w:r>
+      <w:r>
+        <w:rPr>
+          <w:rFonts w:ascii="Calibri" w:hAnsi="Calibri" w:cs="Calibri" w:eastAsia="Calibri"/>
           <w:b w:val="0"/>
           <w:i w:val="0"/>
           <w:sz w:val="21"/>
         </w:rPr>
-        <w:t>ELK Stack: Collects and analyzes application logs.</w:t>
+        <w:t xml:space="preserve"> Collects and analyzes application logs.</w:t>
       </w:r>
     </w:p>
     <w:p>
@@ -6676,11 +7020,20 @@
       <w:r>
         <w:rPr>
           <w:rFonts w:ascii="Calibri" w:hAnsi="Calibri" w:cs="Calibri" w:eastAsia="Calibri"/>
+          <w:b/>
+          <w:i w:val="0"/>
+          <w:sz w:val="21"/>
+        </w:rPr>
+        <w:t>ALERTS:</w:t>
+      </w:r>
+      <w:r>
+        <w:rPr>
+          <w:rFonts w:ascii="Calibri" w:hAnsi="Calibri" w:cs="Calibri" w:eastAsia="Calibri"/>
           <w:b w:val="0"/>
           <w:i w:val="0"/>
           <w:sz w:val="21"/>
         </w:rPr>
-        <w:t>Alerts: Notify the team when defined thresholds are exceeded.</w:t>
+        <w:t xml:space="preserve"> Notify the team when defined thresholds are exceeded.</w:t>
       </w:r>
     </w:p>
     <w:p>
@@ -6702,11 +7055,20 @@
       <w:r>
         <w:rPr>
           <w:rFonts w:ascii="Calibri" w:hAnsi="Calibri" w:cs="Calibri" w:eastAsia="Calibri"/>
+          <w:b/>
+          <w:i w:val="0"/>
+          <w:sz w:val="21"/>
+        </w:rPr>
+        <w:t>USER FEEDBACK:</w:t>
+      </w:r>
+      <w:r>
+        <w:rPr>
+          <w:rFonts w:ascii="Calibri" w:hAnsi="Calibri" w:cs="Calibri" w:eastAsia="Calibri"/>
           <w:b w:val="0"/>
           <w:i w:val="0"/>
           <w:sz w:val="21"/>
         </w:rPr>
-        <w:t>User feedback: Helps identify problems experienced by customers.</w:t>
+        <w:t xml:space="preserve"> Helps identify problems experienced by customers.</w:t>
       </w:r>
     </w:p>
     <w:p>
@@ -7490,11 +7852,20 @@
       <w:r>
         <w:rPr>
           <w:rFonts w:ascii="Calibri" w:hAnsi="Calibri" w:cs="Calibri" w:eastAsia="Calibri"/>
+          <w:b/>
+          <w:i w:val="0"/>
+          <w:sz w:val="21"/>
+        </w:rPr>
+        <w:t>PUPPET MASTER:</w:t>
+      </w:r>
+      <w:r>
+        <w:rPr>
+          <w:rFonts w:ascii="Calibri" w:hAnsi="Calibri" w:cs="Calibri" w:eastAsia="Calibri"/>
           <w:b w:val="0"/>
           <w:i w:val="0"/>
           <w:sz w:val="21"/>
         </w:rPr>
-        <w:t>Puppet Master: Stores configuration rules and manages configurations.</w:t>
+        <w:t xml:space="preserve"> Stores configuration rules and manages configurations.</w:t>
       </w:r>
     </w:p>
     <w:p>
@@ -7516,11 +7887,20 @@
       <w:r>
         <w:rPr>
           <w:rFonts w:ascii="Calibri" w:hAnsi="Calibri" w:cs="Calibri" w:eastAsia="Calibri"/>
+          <w:b/>
+          <w:i w:val="0"/>
+          <w:sz w:val="21"/>
+        </w:rPr>
+        <w:t>PUPPET AGENT:</w:t>
+      </w:r>
+      <w:r>
+        <w:rPr>
+          <w:rFonts w:ascii="Calibri" w:hAnsi="Calibri" w:cs="Calibri" w:eastAsia="Calibri"/>
           <w:b w:val="0"/>
           <w:i w:val="0"/>
           <w:sz w:val="21"/>
         </w:rPr>
-        <w:t>Puppet Agent: Runs on managed servers and communicates with the master.</w:t>
+        <w:t xml:space="preserve"> Runs on managed servers and communicates with the master.</w:t>
       </w:r>
     </w:p>
     <w:p>
@@ -7542,11 +7922,20 @@
       <w:r>
         <w:rPr>
           <w:rFonts w:ascii="Calibri" w:hAnsi="Calibri" w:cs="Calibri" w:eastAsia="Calibri"/>
+          <w:b/>
+          <w:i w:val="0"/>
+          <w:sz w:val="21"/>
+        </w:rPr>
+        <w:t>MANIFEST:</w:t>
+      </w:r>
+      <w:r>
+        <w:rPr>
+          <w:rFonts w:ascii="Calibri" w:hAnsi="Calibri" w:cs="Calibri" w:eastAsia="Calibri"/>
           <w:b w:val="0"/>
           <w:i w:val="0"/>
           <w:sz w:val="21"/>
         </w:rPr>
-        <w:t>Manifest: Defines the desired configuration, such as installed packages and services.</w:t>
+        <w:t xml:space="preserve"> Defines the desired configuration, such as installed packages and services.</w:t>
       </w:r>
     </w:p>
     <w:p>
@@ -7568,11 +7957,20 @@
       <w:r>
         <w:rPr>
           <w:rFonts w:ascii="Calibri" w:hAnsi="Calibri" w:cs="Calibri" w:eastAsia="Calibri"/>
+          <w:b/>
+          <w:i w:val="0"/>
+          <w:sz w:val="21"/>
+        </w:rPr>
+        <w:t>CONFIGURATION ENFORCEMENT:</w:t>
+      </w:r>
+      <w:r>
+        <w:rPr>
+          <w:rFonts w:ascii="Calibri" w:hAnsi="Calibri" w:cs="Calibri" w:eastAsia="Calibri"/>
           <w:b w:val="0"/>
           <w:i w:val="0"/>
           <w:sz w:val="21"/>
         </w:rPr>
-        <w:t>Configuration enforcement: The agent checks and applies the required configuration.</w:t>
+        <w:t xml:space="preserve"> The agent checks and applies the required configuration.</w:t>
       </w:r>
     </w:p>
     <w:p>
@@ -8454,11 +8852,20 @@
       <w:r>
         <w:rPr>
           <w:rFonts w:ascii="Calibri" w:hAnsi="Calibri" w:cs="Calibri" w:eastAsia="Calibri"/>
+          <w:b/>
+          <w:i w:val="0"/>
+          <w:sz w:val="21"/>
+        </w:rPr>
+        <w:t>ELASTICSEARCH:</w:t>
+      </w:r>
+      <w:r>
+        <w:rPr>
+          <w:rFonts w:ascii="Calibri" w:hAnsi="Calibri" w:cs="Calibri" w:eastAsia="Calibri"/>
           <w:b w:val="0"/>
           <w:i w:val="0"/>
           <w:sz w:val="21"/>
         </w:rPr>
-        <w:t>Elasticsearch: Indexes, stores and searches log data.</w:t>
+        <w:t xml:space="preserve"> Indexes, stores and searches log data.</w:t>
       </w:r>
     </w:p>
     <w:p>
@@ -8480,11 +8887,20 @@
       <w:r>
         <w:rPr>
           <w:rFonts w:ascii="Calibri" w:hAnsi="Calibri" w:cs="Calibri" w:eastAsia="Calibri"/>
+          <w:b/>
+          <w:i w:val="0"/>
+          <w:sz w:val="21"/>
+        </w:rPr>
+        <w:t>LOGSTASH:</w:t>
+      </w:r>
+      <w:r>
+        <w:rPr>
+          <w:rFonts w:ascii="Calibri" w:hAnsi="Calibri" w:cs="Calibri" w:eastAsia="Calibri"/>
           <w:b w:val="0"/>
           <w:i w:val="0"/>
           <w:sz w:val="21"/>
         </w:rPr>
-        <w:t>Logstash: Collects, processes and transforms logs.</w:t>
+        <w:t xml:space="preserve"> Collects, processes and transforms logs.</w:t>
       </w:r>
     </w:p>
     <w:p>
@@ -8506,11 +8922,20 @@
       <w:r>
         <w:rPr>
           <w:rFonts w:ascii="Calibri" w:hAnsi="Calibri" w:cs="Calibri" w:eastAsia="Calibri"/>
+          <w:b/>
+          <w:i w:val="0"/>
+          <w:sz w:val="21"/>
+        </w:rPr>
+        <w:t>KIBANA:</w:t>
+      </w:r>
+      <w:r>
+        <w:rPr>
+          <w:rFonts w:ascii="Calibri" w:hAnsi="Calibri" w:cs="Calibri" w:eastAsia="Calibri"/>
           <w:b w:val="0"/>
           <w:i w:val="0"/>
           <w:sz w:val="21"/>
         </w:rPr>
-        <w:t>Kibana: Displays logs through dashboards and visualizations.</w:t>
+        <w:t xml:space="preserve"> Displays logs through dashboards and visualizations.</w:t>
       </w:r>
     </w:p>
     <w:p>
@@ -8902,11 +9327,20 @@
       <w:r>
         <w:rPr>
           <w:rFonts w:ascii="Calibri" w:hAnsi="Calibri" w:cs="Calibri" w:eastAsia="Calibri"/>
+          <w:b/>
+          <w:i w:val="0"/>
+          <w:sz w:val="21"/>
+        </w:rPr>
+        <w:t>E – ELASTICSEARCH:</w:t>
+      </w:r>
+      <w:r>
+        <w:rPr>
+          <w:rFonts w:ascii="Calibri" w:hAnsi="Calibri" w:cs="Calibri" w:eastAsia="Calibri"/>
           <w:b w:val="0"/>
           <w:i w:val="0"/>
           <w:sz w:val="21"/>
         </w:rPr>
-        <w:t>E – Elasticsearch: Stores and searches indexed logs.</w:t>
+        <w:t xml:space="preserve"> Stores and searches indexed logs.</w:t>
       </w:r>
     </w:p>
     <w:p>
@@ -8928,11 +9362,20 @@
       <w:r>
         <w:rPr>
           <w:rFonts w:ascii="Calibri" w:hAnsi="Calibri" w:cs="Calibri" w:eastAsia="Calibri"/>
+          <w:b/>
+          <w:i w:val="0"/>
+          <w:sz w:val="21"/>
+        </w:rPr>
+        <w:t>L – LOGSTASH:</w:t>
+      </w:r>
+      <w:r>
+        <w:rPr>
+          <w:rFonts w:ascii="Calibri" w:hAnsi="Calibri" w:cs="Calibri" w:eastAsia="Calibri"/>
           <w:b w:val="0"/>
           <w:i w:val="0"/>
           <w:sz w:val="21"/>
         </w:rPr>
-        <w:t>L – Logstash: Collects and processes logs.</w:t>
+        <w:t xml:space="preserve"> Collects and processes logs.</w:t>
       </w:r>
     </w:p>
     <w:p>
@@ -8954,11 +9397,20 @@
       <w:r>
         <w:rPr>
           <w:rFonts w:ascii="Calibri" w:hAnsi="Calibri" w:cs="Calibri" w:eastAsia="Calibri"/>
+          <w:b/>
+          <w:i w:val="0"/>
+          <w:sz w:val="21"/>
+        </w:rPr>
+        <w:t>K – KIBANA:</w:t>
+      </w:r>
+      <w:r>
+        <w:rPr>
+          <w:rFonts w:ascii="Calibri" w:hAnsi="Calibri" w:cs="Calibri" w:eastAsia="Calibri"/>
           <w:b w:val="0"/>
           <w:i w:val="0"/>
           <w:sz w:val="21"/>
         </w:rPr>
-        <w:t>K – Kibana: Visualizes logs using dashboards.</w:t>
+        <w:t xml:space="preserve"> Visualizes logs using dashboards.</w:t>
       </w:r>
     </w:p>
     <w:p>
@@ -9350,11 +9802,20 @@
       <w:r>
         <w:rPr>
           <w:rFonts w:ascii="Calibri" w:hAnsi="Calibri" w:cs="Calibri" w:eastAsia="Calibri"/>
+          <w:b/>
+          <w:i w:val="0"/>
+          <w:sz w:val="21"/>
+        </w:rPr>
+        <w:t>AZURE BOARDS:</w:t>
+      </w:r>
+      <w:r>
+        <w:rPr>
+          <w:rFonts w:ascii="Calibri" w:hAnsi="Calibri" w:cs="Calibri" w:eastAsia="Calibri"/>
           <w:b w:val="0"/>
           <w:i w:val="0"/>
           <w:sz w:val="21"/>
         </w:rPr>
-        <w:t>Azure Boards: Plans work and tracks tasks and bugs.</w:t>
+        <w:t xml:space="preserve"> Plans work and tracks tasks and bugs.</w:t>
       </w:r>
     </w:p>
     <w:p>
@@ -9376,11 +9837,20 @@
       <w:r>
         <w:rPr>
           <w:rFonts w:ascii="Calibri" w:hAnsi="Calibri" w:cs="Calibri" w:eastAsia="Calibri"/>
+          <w:b/>
+          <w:i w:val="0"/>
+          <w:sz w:val="21"/>
+        </w:rPr>
+        <w:t>AZURE REPOS:</w:t>
+      </w:r>
+      <w:r>
+        <w:rPr>
+          <w:rFonts w:ascii="Calibri" w:hAnsi="Calibri" w:cs="Calibri" w:eastAsia="Calibri"/>
           <w:b w:val="0"/>
           <w:i w:val="0"/>
           <w:sz w:val="21"/>
         </w:rPr>
-        <w:t>Azure Repos: Stores and manages source code.</w:t>
+        <w:t xml:space="preserve"> Stores and manages source code.</w:t>
       </w:r>
     </w:p>
     <w:p>
@@ -9402,11 +9872,20 @@
       <w:r>
         <w:rPr>
           <w:rFonts w:ascii="Calibri" w:hAnsi="Calibri" w:cs="Calibri" w:eastAsia="Calibri"/>
+          <w:b/>
+          <w:i w:val="0"/>
+          <w:sz w:val="21"/>
+        </w:rPr>
+        <w:t>AZURE PIPELINES:</w:t>
+      </w:r>
+      <w:r>
+        <w:rPr>
+          <w:rFonts w:ascii="Calibri" w:hAnsi="Calibri" w:cs="Calibri" w:eastAsia="Calibri"/>
           <w:b w:val="0"/>
           <w:i w:val="0"/>
           <w:sz w:val="21"/>
         </w:rPr>
-        <w:t>Azure Pipelines: Automates builds, tests and deployments.</w:t>
+        <w:t xml:space="preserve"> Automates builds, tests and deployments.</w:t>
       </w:r>
     </w:p>
     <w:p>
@@ -9428,27 +9907,55 @@
       <w:r>
         <w:rPr>
           <w:rFonts w:ascii="Calibri" w:hAnsi="Calibri" w:cs="Calibri" w:eastAsia="Calibri"/>
+          <w:b/>
+          <w:i w:val="0"/>
+          <w:sz w:val="21"/>
+        </w:rPr>
+        <w:t>AZURE TEST PLANS:</w:t>
+      </w:r>
+      <w:r>
+        <w:rPr>
+          <w:rFonts w:ascii="Calibri" w:hAnsi="Calibri" w:cs="Calibri" w:eastAsia="Calibri"/>
           <w:b w:val="0"/>
           <w:i w:val="0"/>
           <w:sz w:val="21"/>
         </w:rPr>
-        <w:t>Azure Test Plans: Supports test planning and management.</w:t>
-      </w:r>
-    </w:p>
-    <w:p>
-      <w:pPr>
-        <w:keepNext/>
-        <w:spacing w:after="60" w:before="160" w:line="269" w:lineRule="auto"/>
-        <w:jc w:val="left"/>
-      </w:pPr>
-      <w:r>
-        <w:rPr>
-          <w:rFonts w:ascii="Calibri" w:hAnsi="Calibri" w:cs="Calibri" w:eastAsia="Calibri"/>
-          <w:b/>
-          <w:i w:val="0"/>
-          <w:sz w:val="21"/>
-        </w:rPr>
-        <w:t>5. AZURE ARTIFACTS: HOSTS AND SHARES PACKAGES.</w:t>
+        <w:t xml:space="preserve"> Supports test planning and management.</w:t>
+      </w:r>
+    </w:p>
+    <w:p>
+      <w:pPr>
+        <w:keepNext w:val="0"/>
+        <w:spacing w:after="50" w:before="0" w:line="264" w:lineRule="auto"/>
+        <w:ind w:left="369" w:hanging="227"/>
+        <w:jc w:val="left"/>
+      </w:pPr>
+      <w:r>
+        <w:rPr>
+          <w:rFonts w:ascii="Calibri" w:hAnsi="Calibri" w:cs="Calibri" w:eastAsia="Calibri"/>
+          <w:b/>
+          <w:color w:val="000000"/>
+          <w:sz w:val="21"/>
+        </w:rPr>
+        <w:t xml:space="preserve">5. </w:t>
+      </w:r>
+      <w:r>
+        <w:rPr>
+          <w:rFonts w:ascii="Calibri" w:hAnsi="Calibri" w:cs="Calibri" w:eastAsia="Calibri"/>
+          <w:b/>
+          <w:i w:val="0"/>
+          <w:sz w:val="21"/>
+        </w:rPr>
+        <w:t>AZURE ARTIFACTS:</w:t>
+      </w:r>
+      <w:r>
+        <w:rPr>
+          <w:rFonts w:ascii="Calibri" w:hAnsi="Calibri" w:cs="Calibri" w:eastAsia="Calibri"/>
+          <w:b w:val="0"/>
+          <w:i w:val="0"/>
+          <w:sz w:val="21"/>
+        </w:rPr>
+        <w:t xml:space="preserve"> Hosts and shares packages.</w:t>
       </w:r>
     </w:p>
     <w:p>
@@ -10569,11 +11076,20 @@
       <w:r>
         <w:rPr>
           <w:rFonts w:ascii="Calibri" w:hAnsi="Calibri" w:cs="Calibri" w:eastAsia="Calibri"/>
+          <w:b/>
+          <w:i w:val="0"/>
+          <w:sz w:val="21"/>
+        </w:rPr>
+        <w:t>CREATE THE APPLICATION:</w:t>
+      </w:r>
+      <w:r>
+        <w:rPr>
+          <w:rFonts w:ascii="Calibri" w:hAnsi="Calibri" w:cs="Calibri" w:eastAsia="Calibri"/>
           <w:b w:val="0"/>
           <w:i w:val="0"/>
           <w:sz w:val="21"/>
         </w:rPr>
-        <w:t>Create the application: Write the web application and its dependency file.</w:t>
+        <w:t xml:space="preserve"> Write the web application and its dependency file.</w:t>
       </w:r>
     </w:p>
     <w:p>
@@ -10595,11 +11111,20 @@
       <w:r>
         <w:rPr>
           <w:rFonts w:ascii="Calibri" w:hAnsi="Calibri" w:cs="Calibri" w:eastAsia="Calibri"/>
+          <w:b/>
+          <w:i w:val="0"/>
+          <w:sz w:val="21"/>
+        </w:rPr>
+        <w:t>CREATE A DOCKERFILE:</w:t>
+      </w:r>
+      <w:r>
+        <w:rPr>
+          <w:rFonts w:ascii="Calibri" w:hAnsi="Calibri" w:cs="Calibri" w:eastAsia="Calibri"/>
           <w:b w:val="0"/>
           <w:i w:val="0"/>
           <w:sz w:val="21"/>
         </w:rPr>
-        <w:t>Create a Dockerfile: Define the base image, dependencies and startup command.</w:t>
+        <w:t xml:space="preserve"> Define the base image, dependencies and startup command.</w:t>
       </w:r>
     </w:p>
     <w:p>
@@ -10621,11 +11146,20 @@
       <w:r>
         <w:rPr>
           <w:rFonts w:ascii="Calibri" w:hAnsi="Calibri" w:cs="Calibri" w:eastAsia="Calibri"/>
+          <w:b/>
+          <w:i w:val="0"/>
+          <w:sz w:val="21"/>
+        </w:rPr>
+        <w:t>BUILD AN IMAGE:</w:t>
+      </w:r>
+      <w:r>
+        <w:rPr>
+          <w:rFonts w:ascii="Calibri" w:hAnsi="Calibri" w:cs="Calibri" w:eastAsia="Calibri"/>
           <w:b w:val="0"/>
           <w:i w:val="0"/>
           <w:sz w:val="21"/>
         </w:rPr>
-        <w:t xml:space="preserve">Build an image: Use </w:t>
+        <w:t xml:space="preserve"> Use </w:t>
       </w:r>
       <w:r>
         <w:rPr>
@@ -10667,11 +11201,20 @@
       <w:r>
         <w:rPr>
           <w:rFonts w:ascii="Calibri" w:hAnsi="Calibri" w:cs="Calibri" w:eastAsia="Calibri"/>
+          <w:b/>
+          <w:i w:val="0"/>
+          <w:sz w:val="21"/>
+        </w:rPr>
+        <w:t>RUN A CONTAINER:</w:t>
+      </w:r>
+      <w:r>
+        <w:rPr>
+          <w:rFonts w:ascii="Calibri" w:hAnsi="Calibri" w:cs="Calibri" w:eastAsia="Calibri"/>
           <w:b w:val="0"/>
           <w:i w:val="0"/>
           <w:sz w:val="21"/>
         </w:rPr>
-        <w:t xml:space="preserve">Run a container: Use </w:t>
+        <w:t xml:space="preserve"> Use </w:t>
       </w:r>
       <w:r>
         <w:rPr>
@@ -10713,11 +11256,20 @@
       <w:r>
         <w:rPr>
           <w:rFonts w:ascii="Calibri" w:hAnsi="Calibri" w:cs="Calibri" w:eastAsia="Calibri"/>
+          <w:b/>
+          <w:i w:val="0"/>
+          <w:sz w:val="21"/>
+        </w:rPr>
+        <w:t>ACCESS THE APPLICATION:</w:t>
+      </w:r>
+      <w:r>
+        <w:rPr>
+          <w:rFonts w:ascii="Calibri" w:hAnsi="Calibri" w:cs="Calibri" w:eastAsia="Calibri"/>
           <w:b w:val="0"/>
           <w:i w:val="0"/>
           <w:sz w:val="21"/>
         </w:rPr>
-        <w:t>Access the application: Map a host port to the container port if external access is needed.</w:t>
+        <w:t xml:space="preserve"> Map a host port to the container port if external access is needed.</w:t>
       </w:r>
     </w:p>
     <w:p>
@@ -10739,11 +11291,20 @@
       <w:r>
         <w:rPr>
           <w:rFonts w:ascii="Calibri" w:hAnsi="Calibri" w:cs="Calibri" w:eastAsia="Calibri"/>
+          <w:b/>
+          <w:i w:val="0"/>
+          <w:sz w:val="21"/>
+        </w:rPr>
+        <w:t>DEPLOY THE APPLICATION:</w:t>
+      </w:r>
+      <w:r>
+        <w:rPr>
+          <w:rFonts w:ascii="Calibri" w:hAnsi="Calibri" w:cs="Calibri" w:eastAsia="Calibri"/>
           <w:b w:val="0"/>
           <w:i w:val="0"/>
           <w:sz w:val="21"/>
         </w:rPr>
-        <w:t>Deploy the application: Use the same image in compatible testing and production environments.</w:t>
+        <w:t xml:space="preserve"> Use the same image in compatible testing and production environments.</w:t>
       </w:r>
     </w:p>
     <w:p>

</xml_diff>